<commit_message>
Add audio generation pipeline for ABC alphabet videos + GPU quality profiles
- Create abc-alphabets/generate-audio.js: generates TTS voice per letter
  ("A for Apple", "B for Ball" etc.) + 5-layer cheerful BGM using edge-tts
- Uncomment Audio components in AlphabetShortsTemplate.tsx so videos have sound
- Update render-all.ps1 with 3-step pipeline: audio -> register -> render
- Add quality profiles: hd (1080p CRF18), 4k (2160p CRF16), max (4K CRF12 25Mbps)
- Update render-all.sh with same features for Linux/Mac
- Add abc-alphabets catalog, alphabet-shorts, Hindi poems/stories render scripts
- Include BULK-SHORTS-PLAN.md and existing alphabet-fruits audio files

Co-Authored-By: Claude Opus 4.6 (1M context) <noreply@anthropic.com>
</commit_message>
<xml_diff>
--- a/hindi-poems/Hindi-Poems-Audio-Scripts.docx
+++ b/hindi-poems/Hindi-Poems-Audio-Scripts.docx
@@ -62,7 +62,7 @@
           <w:sz w:val="24"/>
           <w:szCs w:val="24"/>
         </w:rPr>
-        <w:t xml:space="preserve">Generated: March 26, 2026</w:t>
+        <w:t xml:space="preserve">Generated: March 27, 2026</w:t>
       </w:r>
     </w:p>
     <w:p>
@@ -7040,7 +7040,7 @@
           <w:sz w:val="24"/>
           <w:szCs w:val="24"/>
         </w:rPr>
-        <w:t xml:space="preserve">घोड़े की दुम पे जो मारा हथौड़ा</w:t>
+        <w:t xml:space="preserve">घोड़े की दुम पर जो मारा हथौड़ा</w:t>
       </w:r>
     </w:p>
     <w:p>
@@ -7279,7 +7279,7 @@
           <w:sz w:val="24"/>
           <w:szCs w:val="24"/>
         </w:rPr>
-        <w:t xml:space="preserve">अक्कड़ बक्कड़ बंबे बो</w:t>
+        <w:t xml:space="preserve">अक्कड़ बक्कड़ बम्बे बो</w:t>
       </w:r>
     </w:p>
     <w:p>
@@ -11767,7 +11767,7 @@
           <w:sz w:val="24"/>
           <w:szCs w:val="24"/>
         </w:rPr>
-        <w:t xml:space="preserve">छुक छुक छुक छुक रेल गाड़ी</w:t>
+        <w:t xml:space="preserve">रेल गाड़ी रेल गाड़ी छुक छुक छुक</w:t>
       </w:r>
     </w:p>
     <w:p>
@@ -11792,7 +11792,7 @@
           <w:sz w:val="24"/>
           <w:szCs w:val="24"/>
         </w:rPr>
-        <w:t xml:space="preserve">पटरी पर दौड़े सवारी</w:t>
+        <w:t xml:space="preserve">रेल गाड़ी रेल गाड़ी छुक छुक छुक</w:t>
       </w:r>
     </w:p>
     <w:p>
@@ -11817,7 +11817,7 @@
           <w:sz w:val="24"/>
           <w:szCs w:val="24"/>
         </w:rPr>
-        <w:t xml:space="preserve">गार्ड ने बाजा बजाया</w:t>
+        <w:t xml:space="preserve">पटरी पर दौड़ी आई रेल गाड़ी</w:t>
       </w:r>
     </w:p>
     <w:p>
@@ -11842,7 +11842,7 @@
           <w:sz w:val="24"/>
           <w:szCs w:val="24"/>
         </w:rPr>
-        <w:t xml:space="preserve">इंजन ने ज़ोर लगाया</w:t>
+        <w:t xml:space="preserve">गार्ड ने दिखाई हरी झंडी</w:t>
       </w:r>
     </w:p>
     <w:p>
@@ -11867,7 +11867,7 @@
           <w:sz w:val="24"/>
           <w:szCs w:val="24"/>
         </w:rPr>
-        <w:t xml:space="preserve">स्टेशन से स्टेशन जाए</w:t>
+        <w:t xml:space="preserve">इंजन ने सीटी बजाई</w:t>
       </w:r>
     </w:p>
     <w:p>
@@ -11892,7 +11892,7 @@
           <w:sz w:val="24"/>
           <w:szCs w:val="24"/>
         </w:rPr>
-        <w:t xml:space="preserve">सबको मंज़िल पहुँचाए</w:t>
+        <w:t xml:space="preserve">सबको मंज़िल पहुँचाई</w:t>
       </w:r>
     </w:p>
     <w:p>
@@ -11942,7 +11942,7 @@
           <w:sz w:val="24"/>
           <w:szCs w:val="24"/>
         </w:rPr>
-        <w:t xml:space="preserve">सबके दिल में प्यार जगाए</w:t>
+        <w:t xml:space="preserve">रेल गाड़ी सबके मन को भाए</w:t>
       </w:r>
     </w:p>
     <w:p>

</xml_diff>